<commit_message>
Practice templates: remove the classification-marking line
Owner direction, 21 October 2026. "[CLASSIFICATION: when filled in, mark as your security classification
guide and PSO direct]" is gone from every practice template: the docx headers, and row 2 of each workbook
sheet (left empty and shrunk, so formulas keep their rows). The training-sample notice stays. A test keeps
the line from returning.
</commit_message>
<xml_diff>
--- a/public/training/library/training-samples/SBD-Training-AC-Plan.docx
+++ b/public/training/library/training-samples/SBD-Training-AC-Plan.docx
@@ -11913,22 +11913,6 @@
 
 <file path=word/header1.xml><?xml version="1.0" encoding="utf-8"?>
 <w:hdr xmlns:wpc="http://schemas.microsoft.com/office/word/2010/wordprocessingCanvas" xmlns:mc="http://schemas.openxmlformats.org/markup-compatibility/2006" xmlns:o="urn:schemas-microsoft-com:office:office" xmlns:r="http://schemas.openxmlformats.org/officeDocument/2006/relationships" xmlns:m="http://schemas.openxmlformats.org/officeDocument/2006/math" xmlns:v="urn:schemas-microsoft-com:vml" xmlns:wp14="http://schemas.microsoft.com/office/word/2010/wordprocessingDrawing" xmlns:wp="http://schemas.openxmlformats.org/drawingml/2006/wordprocessingDrawing" xmlns:w10="urn:schemas-microsoft-com:office:word" xmlns:w="http://schemas.openxmlformats.org/wordprocessingml/2006/main" xmlns:w14="http://schemas.microsoft.com/office/word/2010/wordml" xmlns:w15="http://schemas.microsoft.com/office/word/2012/wordml" xmlns:wpg="http://schemas.microsoft.com/office/word/2010/wordprocessingGroup" xmlns:wpi="http://schemas.microsoft.com/office/word/2010/wordprocessingInk" xmlns:wne="http://schemas.microsoft.com/office/word/2006/wordml" xmlns:wps="http://schemas.microsoft.com/office/word/2010/wordprocessingShape" xmlns:cx="http://schemas.microsoft.com/office/drawing/2014/chartex" xmlns:cx1="http://schemas.microsoft.com/office/drawing/2015/9/8/chartex" xmlns:cx2="http://schemas.microsoft.com/office/drawing/2015/10/21/chartex" xmlns:cx3="http://schemas.microsoft.com/office/drawing/2016/5/9/chartex" xmlns:cx4="http://schemas.microsoft.com/office/drawing/2016/5/10/chartex" xmlns:cx5="http://schemas.microsoft.com/office/drawing/2016/5/11/chartex" xmlns:cx6="http://schemas.microsoft.com/office/drawing/2016/5/12/chartex" xmlns:cx7="http://schemas.microsoft.com/office/drawing/2016/5/13/chartex" xmlns:cx8="http://schemas.microsoft.com/office/drawing/2016/5/14/chartex" xmlns:w16cid="http://schemas.microsoft.com/office/word/2016/wordml/cid" xmlns:w16se="http://schemas.microsoft.com/office/word/2015/wordml/symex">
-  <w:p>
-    <w:pPr>
-      <w:jc w:val="center"/>
-    </w:pPr>
-    <w:r>
-      <w:rPr>
-        <w:rFonts w:ascii="Arial" w:cs="Arial" w:eastAsia="Arial" w:hAnsi="Arial"/>
-        <w:i/>
-        <w:iCs/>
-        <w:color w:val="6B7280"/>
-        <w:sz w:val="16"/>
-        <w:szCs w:val="16"/>
-      </w:rPr>
-      <w:t xml:space="preserve">[CLASSIFICATION: when filled in, mark as your security classification guide and PSO direct]</w:t>
-    </w:r>
-  </w:p>
   <w:p>
     <w:pPr>
       <w:pBdr>

</xml_diff>